<commit_message>
Update Kolibri cover letter and CV; rebuild ATS PDF/DOCX
Cover letter rewritten in Meriç's new voice, with two accuracy tweaks kept honest:
"modelled" (not "validated") projection of +15.5% ARPDAU, and RocketIO reframed as a
design point rather than an unbacked engagement claim.

CV: new Summary; the F2P economy project reframed honestly as synthetic telemetry
(not "live/real" data); experience reordered to true reverse-chronological (Viatris
before Saksı); TRY 1.37M seed figure added; idle-games list updated (Idle Maple Story).

build-ats-docs.py is the generator for the ATS PDF/DOCX (the *-ats.html files are
reference mirrors) — its content was brought to the final text and the four downloadables
regenerated. cv-ats.html / cover-letter-ats.html kept in sync.

Co-Authored-By: Claude Opus 4.8 <noreply@anthropic.com>
Claude-Session: https://claude.ai/code/session_013Apb7ZAW2b3HZxkpyn9maP
</commit_message>
<xml_diff>
--- a/Meric_Erler_CV.docx
+++ b/Meric_Erler_CV.docx
@@ -78,7 +78,7 @@
           <w:b w:val="0"/>
           <w:sz w:val="21"/>
         </w:rPr>
-        <w:t>I work a game economy from three sides at once: as a P&amp;L, as a design system, and as the code that runs it. Three years as a business and financial data analyst (pharma, edtech, equity research) built the first; moving into game economy design and building my own games built the rest. Economic modelling, statistics, monetization and KPIs are the toolkit; the Idle Bank Tycoon case study, my portfolio and the cover letter are the evidence.</w:t>
+        <w:t>Game Economy Designer combining three years of business analytics (pharma, edtech, equity research) with hands-on indie game design and development. I balance progression curves, model monetization levers, and diagnose the health of a game economy from an analytical angle, building the spreadsheets and dashboards behind the call. The cover letter, portfolio and an Idle Bank Tycoon case study (linked) hold the proof.</w:t>
       </w:r>
     </w:p>
     <w:p>
@@ -256,7 +256,7 @@
           <w:b/>
           <w:sz w:val="21"/>
         </w:rPr>
-        <w:t xml:space="preserve">Free-to-Play Game Economy &amp; Balance </w:t>
+        <w:t xml:space="preserve">F2P Game Economy &amp; Balance </w:t>
       </w:r>
       <w:r>
         <w:rPr>
@@ -264,7 +264,7 @@
           <w:b w:val="0"/>
           <w:sz w:val="21"/>
         </w:rPr>
-        <w:t>(Python, scikit-learn, SQL). The closest analog to live balancing: in a real F2P economy I caught two exploit-grade premium items and a slow currency inflation and shipped the fixes, the unexpected-behaviour problem this role exists to prevent. I also turned first-days cohort data into a model that flags likely payers early, the basis for a concrete onboarding lever. Methods and results in the portfolio.</w:t>
+        <w:t>(Python, scikit-learn, SQL; synthetic data). The closest I have come to live-ops balancing: on synthetic F2P telemetry I built myself, I diagnosed two exploit-grade premium items and a slow currency inflation and modelled the fixes, the unexpected-behaviour problem this role exists to prevent. I also built an early-payer flag from Day 1-3 cohort data (AUC 0.80), the basis for a concrete onboarding lever. Methods and results in the portfolio.</w:t>
       </w:r>
     </w:p>
     <w:p>
@@ -330,7 +330,7 @@
           <w:b w:val="0"/>
           <w:sz w:val="21"/>
         </w:rPr>
-        <w:t>A Classic-WoW-style RPG reimagined as an idle game, the genre I spend the most time in (Clicker Heroes, Tap Titans, Slayer Legend, Idle Slayer, Legends of Idleon).</w:t>
+        <w:t>A Classic-WoW-style RPG reimagined as an idle game, the genre I spend the most time in (Idle Maple Story, Slayer Legend, Legends of Idleon, Idle Slayer, Clicker Heroes).</w:t>
       </w:r>
     </w:p>
     <w:p>
@@ -451,7 +451,7 @@
           <w:b w:val="0"/>
           <w:sz w:val="21"/>
         </w:rPr>
-        <w:t>Tracked retention, engagement and CAC in Google Analytics and Looker Studio and steered Meta Ads spend; wrote the business plan and growth projections behind a seed crowdfunding raise.</w:t>
+        <w:t>Tracked retention, engagement and CAC in Google Analytics and Looker Studio and steered Meta Ads spend; wrote the business plan and growth projections behind a TRY 1.37M seed crowdfunding round (2022).</w:t>
       </w:r>
     </w:p>
     <w:p>

</xml_diff>